<commit_message>
ADDING TODAY'S WORK - 08.07.2026
</commit_message>
<xml_diff>
--- a/write_up/drafts/3_materials_and_methods/methods_DRAFT_1.docx
+++ b/write_up/drafts/3_materials_and_methods/methods_DRAFT_1.docx
@@ -500,7 +500,19 @@
         <w:t xml:space="preserve"> </w:t>
       </w:r>
       <w:r>
-        <w:t xml:space="preserve">identified through a search of miRNA functional enrichment workflows in the literature, using the protease exposure dataset. </w:t>
+        <w:t xml:space="preserve">identified through a search of miRNA functional enrichment workflows in the literature, using the </w:t>
+      </w:r>
+      <w:r>
+        <w:t>dose 24</w:t>
+      </w:r>
+      <w:r>
+        <w:sym w:font="Symbol" w:char="F06D"/>
+      </w:r>
+      <w:r>
+        <w:t>g protease</w:t>
+      </w:r>
+      <w:r>
+        <w:t xml:space="preserve"> exposure dataset. </w:t>
       </w:r>
       <w:r>
         <w:t xml:space="preserve">The most appropriate method was intended to be selected for pathway analysis of the novel HDM and dog exposure datasets. However, too few DE </w:t>
@@ -624,7 +636,13 @@
         <w:t>background universe.</w:t>
       </w:r>
       <w:r>
-        <w:t xml:space="preserve"> The BH correction was applied to control the FDR. Only pathways containing between 10-500 genes were considered; pathways with an adjusted </w:t>
+        <w:t xml:space="preserve"> The BH correction was applied to control the FDR. Only pathways containing between 10-500 genes were considered; </w:t>
+      </w:r>
+      <w:r>
+        <w:t>p</w:t>
+      </w:r>
+      <w:r>
+        <w:t xml:space="preserve">athways with an adjusted </w:t>
       </w:r>
       <w:r>
         <w:rPr>
@@ -634,7 +652,13 @@
         <w:t>P</w:t>
       </w:r>
       <w:r>
-        <w:t xml:space="preserve"> value &lt; 0.05 and </w:t>
+        <w:t xml:space="preserve"> value &lt; 0.0</w:t>
+      </w:r>
+      <w:r>
+        <w:t>2</w:t>
+      </w:r>
+      <w:r>
+        <w:t xml:space="preserve"> and </w:t>
       </w:r>
       <w:r>
         <w:rPr>
@@ -727,7 +751,19 @@
         <w:t xml:space="preserve"> For </w:t>
       </w:r>
       <w:r>
-        <w:t>miRNA enrichment analysis ((G)SEA)</w:t>
+        <w:t>miRNA</w:t>
+      </w:r>
+      <w:r>
+        <w:t xml:space="preserve">-set </w:t>
+      </w:r>
+      <w:r>
+        <w:t>enrichment analysis (</w:t>
+      </w:r>
+      <w:r>
+        <w:t>miRNA-</w:t>
+      </w:r>
+      <w:r>
+        <w:t>SEA)</w:t>
       </w:r>
       <w:r>
         <w:t>, all miRNAs detected in the experiment were ranked according to log-fold-change (</w:t>

</xml_diff>